<commit_message>
fix(docs): corrige el diagrama de secuencia de autenticación
El diagrama mostraba a AuthUseCaseHandler llamando directo a
JwtService, pero SecurityServiceHandler.login() es quien resuelve
todo internamente (busca el User, valida la contraseña y genera el
JWT); el orchestrator solo hace un passthrough a securityService.login().
Verificado contra AuthUseCaseHandler.java y SecurityServiceHandler.java.
</commit_message>
<xml_diff>
--- a/docs/arquitectura/ARQUITECTURA.docx
+++ b/docs/arquitectura/ARQUITECTURA.docx
@@ -1165,7 +1165,7 @@
             <w:r>
               <w:drawing>
                 <wp:inline distT="0" distB="0" distL="0" distR="0">
-                  <wp:extent cx="6276975" cy="3476625"/>
+                  <wp:extent cx="6276975" cy="3924300"/>
                   <wp:effectExtent t="0" r="0" b="0" l="0"/>
                   <wp:docPr id="1" name="" descr="" title=""/>
                   <wp:cNvGraphicFramePr>
@@ -1190,7 +1190,7 @@
                         <pic:spPr bwMode="auto">
                           <a:xfrm>
                             <a:off x="0" y="0"/>
-                            <a:ext cx="6276975" cy="3476625"/>
+                            <a:ext cx="6276975" cy="3924300"/>
                           </a:xfrm>
                           <a:prstGeom prst="rect">
                             <a:avLst/>

</xml_diff>